<commit_message>
style: aplicar normas APA 7 a ambos documentos (títulos y tablas en negro)
- Plantilla APA: Times New Roman 12, doble espacio, sangría 1,27 cm, número de página arriba a la derecha
- Títulos APA por niveles en negro; tablas solo con líneas horizontales, sin colores
- Tabla N / Figura N en negrita con título en cursiva arriba; notas con 'Nota.'
- Portada de estudiante APA; referencias APA 7 en orden alfabético con sangría francesa
- Gráficas y diagramas sin título dibujado; reglas de IA actualizadas

Co-Authored-By: Claude Opus 5.5 <noreply@anthropic.com>
Claude-Session: https://claude.ai/code/session_01DvLKNimVRrvQKw6BC5SVu6
</commit_message>
<xml_diff>
--- a/assets/plantillas/plantilla_unicartagena.docx
+++ b/assets/plantillas/plantilla_unicartagena.docx
@@ -384,8 +384,9 @@
     </w:p>
     <w:sectPr>
       <w:footerReference w:type="default" r:id="rId9"/>
+      <w:headerReference w:type="default" r:id="rId10"/>
       <w:pgSz w:w="12240" w:h="15840"/>
-      <w:pgMar w:top="1417" w:bottom="1417" w:left="1417" w:right="1417" w:footer="680" w:header="680"/>
+      <w:pgMar w:top="1440" w:bottom="1440" w:left="1440" w:right="1440" w:header="720" w:footer="720"/>
     </w:sectPr>
   </w:body>
 </w:document>
@@ -400,21 +401,8 @@
   <w:p>
     <w:pPr>
       <w:pStyle w:val="Footer"/>
-      <w:jc w:val="right"/>
     </w:pPr>
     <w:r/>
-    <w:r>
-      <w:rPr>
-        <w:color w:val="52514E"/>
-        <w:sz w:val="16"/>
-      </w:rPr>
-      <w:t xml:space="preserve">Kazegami Restaurante · Seminario Taller Creación de Empresas · Universidad de Cartagena    </w:t>
-    </w:r>
-    <w:r>
-      <w:fldChar w:fldCharType="begin"/>
-      <w:instrText xml:space="preserve">PAGE</w:instrText>
-      <w:fldChar w:fldCharType="end"/>
-    </w:r>
   </w:p>
 </w:ftr>
 </file>
@@ -455,6 +443,27 @@
     </w:p>
   </w:footnote>
 </w:footnotes>
+</file>
+
+<file path=word/header1.xml><?xml version="1.0" encoding="utf-8"?>
+<w:hdr xmlns:m="http://schemas.openxmlformats.org/officeDocument/2006/math" xmlns:mc="http://schemas.openxmlformats.org/markup-compatibility/2006" xmlns:mo="http://schemas.microsoft.com/office/mac/office/2008/main" xmlns:mv="urn:schemas-microsoft-com:mac:vml" xmlns:o="urn:schemas-microsoft-com:office:office" xmlns:r="http://schemas.openxmlformats.org/officeDocument/2006/relationships" xmlns:v="urn:schemas-microsoft-com:vml" xmlns:w10="urn:schemas-microsoft-com:office:word" xmlns:w14="http://schemas.microsoft.com/office/word/2010/wordml" xmlns:w="http://schemas.openxmlformats.org/wordprocessingml/2006/main" xmlns:wne="http://schemas.microsoft.com/office/word/2006/wordml" xmlns:wp14="http://schemas.microsoft.com/office/word/2010/wordprocessingDrawing" xmlns:wp="http://schemas.openxmlformats.org/drawingml/2006/wordprocessingDrawing" xmlns:wpc="http://schemas.microsoft.com/office/word/2010/wordprocessingCanvas" xmlns:wpg="http://schemas.microsoft.com/office/word/2010/wordprocessingGroup" xmlns:wpi="http://schemas.microsoft.com/office/word/2010/wordprocessingInk" xmlns:wps="http://schemas.microsoft.com/office/word/2010/wordprocessingShape" mc:Ignorable="w14 wp14">
+  <w:p>
+    <w:pPr>
+      <w:pStyle w:val="Header"/>
+      <w:jc w:val="right"/>
+    </w:pPr>
+    <w:r/>
+    <w:r>
+      <w:rPr>
+        <w:rFonts w:ascii="Times New Roman" w:hAnsi="Times New Roman"/>
+        <w:sz w:val="24"/>
+      </w:rPr>
+      <w:fldChar w:fldCharType="begin"/>
+      <w:instrText xml:space="preserve">PAGE</w:instrText>
+      <w:fldChar w:fldCharType="end"/>
+    </w:r>
+  </w:p>
+</w:hdr>
 </file>
 
 <file path=word/numbering.xml><?xml version="1.0" encoding="utf-8"?>
@@ -590,13 +599,13 @@
     <w:name w:val="Normal"/>
     <w:qFormat/>
     <w:pPr>
-      <w:spacing w:lineRule="auto" w:line="276" w:after="120" w:before="0"/>
-      <w:jc w:val="both"/>
-    </w:pPr>
-    <w:rPr>
-      <w:rFonts w:ascii="Arial" w:hAnsi="Arial" w:cs="Arial" w:eastAsia="Arial"/>
-      <w:color w:val="1F1F1F"/>
-      <w:sz w:val="22"/>
+      <w:spacing w:before="0" w:after="0" w:line="480" w:lineRule="auto"/>
+      <w:jc w:val="left"/>
+    </w:pPr>
+    <w:rPr>
+      <w:rFonts w:ascii="Times New Roman" w:hAnsi="Times New Roman" w:cs="Times New Roman" w:eastAsia="Times New Roman"/>
+      <w:color w:val="000000"/>
+      <w:sz w:val="24"/>
     </w:rPr>
   </w:style>
   <w:style w:type="paragraph" w:styleId="BodyText">
@@ -604,14 +613,15 @@
     <w:basedOn w:val="Normal"/>
     <w:link w:val="BodyTextChar"/>
     <w:pPr>
-      <w:spacing w:before="0" w:after="120" w:lineRule="auto" w:line="276"/>
-      <w:jc w:val="both"/>
-    </w:pPr>
-    <w:qFormat/>
-    <w:rPr>
-      <w:rFonts w:ascii="Arial" w:hAnsi="Arial" w:cs="Arial" w:eastAsia="Arial"/>
-      <w:color w:val="1F1F1F"/>
-      <w:sz w:val="22"/>
+      <w:spacing w:before="0" w:after="0" w:line="480" w:lineRule="auto"/>
+      <w:ind w:firstLine="720"/>
+      <w:jc w:val="left"/>
+    </w:pPr>
+    <w:qFormat/>
+    <w:rPr>
+      <w:rFonts w:ascii="Times New Roman" w:hAnsi="Times New Roman" w:cs="Times New Roman" w:eastAsia="Times New Roman"/>
+      <w:color w:val="000000"/>
+      <w:sz w:val="24"/>
     </w:rPr>
   </w:style>
   <w:style w:type="paragraph" w:customStyle="1" w:styleId="FirstParagraph">
@@ -620,13 +630,14 @@
     <w:next w:val="BodyText"/>
     <w:qFormat/>
     <w:pPr>
-      <w:spacing w:lineRule="auto" w:line="276" w:after="120" w:before="0"/>
-      <w:jc w:val="both"/>
-    </w:pPr>
-    <w:rPr>
-      <w:rFonts w:ascii="Arial" w:hAnsi="Arial" w:cs="Arial" w:eastAsia="Arial"/>
-      <w:color w:val="1F1F1F"/>
-      <w:sz w:val="22"/>
+      <w:spacing w:before="0" w:after="0" w:line="480" w:lineRule="auto"/>
+      <w:ind w:firstLine="720"/>
+      <w:jc w:val="left"/>
+    </w:pPr>
+    <w:rPr>
+      <w:rFonts w:ascii="Times New Roman" w:hAnsi="Times New Roman" w:cs="Times New Roman" w:eastAsia="Times New Roman"/>
+      <w:color w:val="000000"/>
+      <w:sz w:val="24"/>
     </w:rPr>
   </w:style>
   <w:style w:type="paragraph" w:customStyle="1" w:styleId="Compact">
@@ -634,12 +645,14 @@
     <w:basedOn w:val="BodyText"/>
     <w:qFormat/>
     <w:pPr>
-      <w:spacing w:before="36" w:after="36" w:lineRule="auto" w:line="276"/>
-    </w:pPr>
-    <w:rPr>
-      <w:rFonts w:ascii="Arial" w:hAnsi="Arial" w:cs="Arial" w:eastAsia="Arial"/>
-      <w:color w:val="1F1F1F"/>
-      <w:sz w:val="22"/>
+      <w:spacing w:before="0" w:after="0" w:line="240" w:lineRule="auto"/>
+      <w:ind w:firstLine="0"/>
+      <w:jc w:val="left"/>
+    </w:pPr>
+    <w:rPr>
+      <w:rFonts w:ascii="Times New Roman" w:hAnsi="Times New Roman" w:cs="Times New Roman" w:eastAsia="Times New Roman"/>
+      <w:color w:val="000000"/>
+      <w:sz w:val="24"/>
     </w:rPr>
   </w:style>
   <w:style w:type="paragraph" w:styleId="Title">
@@ -650,15 +663,16 @@
     <w:pPr>
       <w:keepNext/>
       <w:keepLines/>
-      <w:spacing w:before="480" w:after="240"/>
+      <w:spacing w:before="0" w:after="0" w:line="480" w:lineRule="auto"/>
       <w:jc w:val="center"/>
     </w:pPr>
     <w:rPr>
-      <w:rFonts w:ascii="Arial" w:hAnsi="Arial" w:cs="Arial" w:eastAsia="Arial"/>
+      <w:rFonts w:ascii="Times New Roman" w:hAnsi="Times New Roman" w:cs="Times New Roman" w:eastAsia="Times New Roman"/>
       <w:b/>
       <w:bCs/>
-      <w:color w:val="1F3A68"/>
-      <w:sz w:val="40"/>
+      <w:i w:val="0"/>
+      <w:color w:val="000000"/>
+      <w:sz w:val="24"/>
       <w:szCs w:val="36"/>
     </w:rPr>
   </w:style>
@@ -670,11 +684,15 @@
     <w:pPr>
       <w:keepNext/>
       <w:keepLines/>
-      <w:spacing w:before="240" w:after="240"/>
+      <w:spacing w:before="0" w:after="0" w:line="480" w:lineRule="auto"/>
       <w:jc w:val="center"/>
     </w:pPr>
     <w:rPr>
-      <w:sz w:val="30"/>
+      <w:rFonts w:ascii="Times New Roman" w:hAnsi="Times New Roman" w:cs="Times New Roman" w:eastAsia="Times New Roman"/>
+      <w:b/>
+      <w:i w:val="0"/>
+      <w:color w:val="000000"/>
+      <w:sz w:val="24"/>
       <w:szCs w:val="30"/>
     </w:rPr>
   </w:style>
@@ -698,6 +716,25 @@
       <w:jc w:val="center"/>
     </w:pPr>
   </w:style>
+  <w:style w:type="paragraph" w:customStyle="1" w:styleId="AbstractTitle">
+    <w:name w:val="Abstract Title"/>
+    <w:basedOn w:val="Normal"/>
+    <w:next w:val="Abstract"/>
+    <w:qFormat/>
+    <w:pPr>
+      <w:keepNext/>
+      <w:keepLines/>
+      <w:jc w:val="center"/>
+      <w:spacing w:before="300" w:after="0"/>
+    </w:pPr>
+    <w:rPr>
+      <w:sz w:val="20"/>
+      <w:szCs w:val="20"/>
+      <w:b/>
+      <w:color w:val="345A8A"/>
+      &gt;
+    </w:rPr>
+  </w:style>
   <w:style w:type="paragraph" w:customStyle="1" w:styleId="Abstract">
     <w:name w:val="Abstract"/>
     <w:basedOn w:val="Normal"/>
@@ -706,7 +743,7 @@
     <w:pPr>
       <w:keepNext/>
       <w:keepLines/>
-      <w:spacing w:before="300" w:after="300"/>
+      <w:spacing w:before="100" w:after="300"/>
     </w:pPr>
     <w:rPr>
       <w:sz w:val="20"/>
@@ -920,6 +957,11 @@
       <w:spacing w:before="100" w:after="100"/>
       <w:ind w:firstLine="0" w:left="480" w:right="480"/>
     </w:pPr>
+    <w:rPr>
+      <w:rFonts w:ascii="Times New Roman" w:hAnsi="Times New Roman" w:cs="Times New Roman" w:eastAsia="Times New Roman"/>
+      <w:color w:val="000000"/>
+      <w:sz w:val="24"/>
+    </w:rPr>
   </w:style>
   <w:style w:type="paragraph" w:styleId="FootnoteText">
     <w:name w:val="Footnote Text"/>
@@ -928,6 +970,11 @@
     <w:uiPriority w:val="9"/>
     <w:unhideWhenUsed/>
     <w:qFormat/>
+    <w:rPr>
+      <w:rFonts w:ascii="Times New Roman" w:hAnsi="Times New Roman" w:cs="Times New Roman" w:eastAsia="Times New Roman"/>
+      <w:color w:val="000000"/>
+      <w:sz w:val="24"/>
+    </w:rPr>
   </w:style>
   <w:style w:type="character" w:default="1" w:styleId="DefaultParagraphFont">
     <w:name w:val="Default Paragraph Font"/>
@@ -949,6 +996,21 @@
         <w:right w:w="108" w:type="dxa"/>
       </w:tblCellMar>
     </w:tblPr>
+    <w:tblStylePr w:type="firstRow">
+      <w:tblPr>
+        <w:jc w:val="left"/>
+        <w:tblInd w:w="0" w:type="dxa"/>
+      </w:tblPr>
+      <w:trPr>
+        <w:jc w:val="left"/>
+      </w:trPr>
+      <w:tcPr>
+        <w:vAlign w:val="bottom"/>
+        <w:tcBorders>
+          <w:bottom w:val="single"/>
+        </w:tcBorders>
+      </w:tcPr>
+    </w:tblStylePr>
   </w:style>
   <w:style w:type="paragraph" w:customStyle="1" w:styleId="DefinitionTerm">
     <w:name w:val="Definition Term"/>
@@ -960,12 +1022,20 @@
       <w:spacing w:after="0"/>
     </w:pPr>
     <w:rPr>
+      <w:rFonts w:ascii="Times New Roman" w:hAnsi="Times New Roman" w:cs="Times New Roman" w:eastAsia="Times New Roman"/>
       <w:b/>
+      <w:color w:val="000000"/>
+      <w:sz w:val="24"/>
     </w:rPr>
   </w:style>
   <w:style w:type="paragraph" w:customStyle="1" w:styleId="Definition">
     <w:name w:val="Definition"/>
     <w:basedOn w:val="Normal"/>
+    <w:rPr>
+      <w:rFonts w:ascii="Times New Roman" w:hAnsi="Times New Roman" w:cs="Times New Roman" w:eastAsia="Times New Roman"/>
+      <w:color w:val="000000"/>
+      <w:sz w:val="24"/>
+    </w:rPr>
   </w:style>
   <w:style w:type="paragraph" w:styleId="Caption">
     <w:name w:val="Caption"/>
@@ -983,30 +1053,33 @@
     <w:basedOn w:val="Caption"/>
     <w:pPr>
       <w:keepNext/>
-      <w:spacing w:before="200" w:after="80"/>
+      <w:spacing w:before="0" w:after="0" w:line="480" w:lineRule="auto"/>
+      <w:ind w:firstLine="0"/>
       <w:jc w:val="left"/>
     </w:pPr>
     <w:rPr>
-      <w:rFonts w:ascii="Arial" w:hAnsi="Arial" w:cs="Arial" w:eastAsia="Arial"/>
-      <w:b/>
-      <w:i w:val="0"/>
-      <w:color w:val="1F3A68"/>
-      <w:sz w:val="19"/>
+      <w:rFonts w:ascii="Times New Roman" w:hAnsi="Times New Roman" w:cs="Times New Roman" w:eastAsia="Times New Roman"/>
+      <w:b w:val="0"/>
+      <w:i/>
+      <w:color w:val="000000"/>
+      <w:sz w:val="24"/>
     </w:rPr>
   </w:style>
   <w:style w:type="paragraph" w:customStyle="1" w:styleId="ImageCaption">
     <w:name w:val="Image Caption"/>
     <w:basedOn w:val="Caption"/>
     <w:pPr>
-      <w:spacing w:after="40"/>
-      <w:jc w:val="center"/>
-    </w:pPr>
-    <w:rPr>
-      <w:rFonts w:ascii="Arial" w:hAnsi="Arial" w:cs="Arial" w:eastAsia="Arial"/>
-      <w:b/>
-      <w:i w:val="0"/>
-      <w:color w:val="1F3A68"/>
-      <w:sz w:val="19"/>
+      <w:keepNext/>
+      <w:spacing w:before="0" w:after="0" w:line="480" w:lineRule="auto"/>
+      <w:ind w:firstLine="0"/>
+      <w:jc w:val="left"/>
+    </w:pPr>
+    <w:rPr>
+      <w:rFonts w:ascii="Times New Roman" w:hAnsi="Times New Roman" w:cs="Times New Roman" w:eastAsia="Times New Roman"/>
+      <w:b w:val="0"/>
+      <w:i/>
+      <w:color w:val="000000"/>
+      <w:sz w:val="24"/>
     </w:rPr>
   </w:style>
   <w:style w:type="paragraph" w:customStyle="1" w:styleId="Figure">
@@ -1018,6 +1091,7 @@
     <w:basedOn w:val="Figure"/>
     <w:pPr>
       <w:keepNext/>
+      <w:spacing w:before="0" w:after="0" w:line="240" w:lineRule="auto"/>
       <w:jc w:val="center"/>
     </w:pPr>
   </w:style>
@@ -1034,6 +1108,10 @@
       <w:sz w:val="22"/>
     </w:rPr>
   </w:style>
+  <w:style w:type="character" w:customStyle="1" w:styleId="SectionNumber">
+    <w:name w:val="Section Number"/>
+    <w:basedOn w:val="BodyTextChar"/>
+  </w:style>
   <w:style w:type="character" w:styleId="FootnoteReference">
     <w:name w:val="Footnote Reference"/>
     <w:basedOn w:val="BodyTextChar"/>
@@ -1045,7 +1123,8 @@
     <w:name w:val="Hyperlink"/>
     <w:basedOn w:val="BodyTextChar"/>
     <w:rPr>
-      <w:color w:val="2A78D6"/>
+      <w:color w:val="000000"/>
+      <w:u w:val="none"/>
     </w:rPr>
   </w:style>
   <w:style w:type="paragraph" w:styleId="TOCHeading">
@@ -1056,99 +1135,143 @@
     <w:unhideWhenUsed/>
     <w:qFormat/>
     <w:pPr>
-      <w:spacing w:before="240" w:line="259" w:lineRule="auto"/>
+      <w:spacing w:before="0" w:line="480" w:lineRule="auto" w:after="0"/>
+      <w:jc w:val="center"/>
       <w:outlineLvl w:val="9"/>
     </w:pPr>
     <w:rPr>
-      <w:rFonts w:ascii="Arial" w:hAnsi="Arial" w:cs="Arial" w:eastAsia="Arial"/>
+      <w:rFonts w:ascii="Times New Roman" w:hAnsi="Times New Roman" w:cs="Times New Roman" w:eastAsia="Times New Roman"/>
       <w:b/>
       <w:bCs w:val="0"/>
-      <w:color w:val="1F3A68"/>
-      <w:sz w:val="32"/>
+      <w:i w:val="0"/>
+      <w:color w:val="000000"/>
+      <w:sz w:val="24"/>
     </w:rPr>
   </w:style>
   <w:style w:type="paragraph" w:customStyle="1" w:styleId="Heading1">
     <w:name w:val="heading 1"/>
-    <w:pPr>
-      <w:keepNext/>
-      <w:spacing w:before="360" w:after="120"/>
-      <w:pBdr>
-        <w:bottom w:val="single" w:sz="8" w:space="4" w:color="2A78D6"/>
-      </w:pBdr>
-    </w:pPr>
-    <w:rPr>
-      <w:rFonts w:ascii="Arial" w:hAnsi="Arial" w:cs="Arial" w:eastAsia="Arial"/>
+    <w:basedOn w:val="Normal"/>
+    <w:pPr>
+      <w:keepNext/>
+      <w:spacing w:before="240" w:after="0" w:line="480" w:lineRule="auto"/>
+      <w:ind w:firstLine="0"/>
+      <w:jc w:val="center"/>
+    </w:pPr>
+    <w:rPr>
+      <w:rFonts w:ascii="Times New Roman" w:hAnsi="Times New Roman" w:cs="Times New Roman" w:eastAsia="Times New Roman"/>
       <w:b/>
-      <w:color w:val="1F3A68"/>
-      <w:sz w:val="32"/>
+      <w:i w:val="0"/>
+      <w:color w:val="000000"/>
+      <w:sz w:val="24"/>
     </w:rPr>
   </w:style>
   <w:style w:type="paragraph" w:customStyle="1" w:styleId="Heading2">
     <w:name w:val="heading 2"/>
-    <w:pPr>
-      <w:keepNext/>
-      <w:spacing w:before="280" w:after="120"/>
-    </w:pPr>
-    <w:rPr>
-      <w:rFonts w:ascii="Arial" w:hAnsi="Arial" w:cs="Arial" w:eastAsia="Arial"/>
+    <w:basedOn w:val="Normal"/>
+    <w:pPr>
+      <w:keepNext/>
+      <w:spacing w:before="240" w:after="0" w:line="480" w:lineRule="auto"/>
+      <w:ind w:firstLine="0"/>
+      <w:jc w:val="left"/>
+    </w:pPr>
+    <w:rPr>
+      <w:rFonts w:ascii="Times New Roman" w:hAnsi="Times New Roman" w:cs="Times New Roman" w:eastAsia="Times New Roman"/>
       <w:b/>
-      <w:color w:val="1F3A68"/>
-      <w:sz w:val="26"/>
+      <w:i w:val="0"/>
+      <w:color w:val="000000"/>
+      <w:sz w:val="24"/>
     </w:rPr>
   </w:style>
   <w:style w:type="paragraph" w:customStyle="1" w:styleId="Heading3">
     <w:name w:val="heading 3"/>
-    <w:pPr>
-      <w:keepNext/>
-      <w:spacing w:before="200" w:after="120"/>
-    </w:pPr>
-    <w:rPr>
-      <w:rFonts w:ascii="Arial" w:hAnsi="Arial" w:cs="Arial" w:eastAsia="Arial"/>
+    <w:basedOn w:val="Normal"/>
+    <w:pPr>
+      <w:keepNext/>
+      <w:spacing w:before="240" w:after="0" w:line="480" w:lineRule="auto"/>
+      <w:ind w:firstLine="0"/>
+      <w:jc w:val="left"/>
+    </w:pPr>
+    <w:rPr>
+      <w:rFonts w:ascii="Times New Roman" w:hAnsi="Times New Roman" w:cs="Times New Roman" w:eastAsia="Times New Roman"/>
       <w:b/>
-      <w:color w:val="2A78D6"/>
-      <w:sz w:val="23"/>
+      <w:i/>
+      <w:color w:val="000000"/>
+      <w:sz w:val="24"/>
+    </w:rPr>
+  </w:style>
+  <w:style w:type="paragraph" w:customStyle="1" w:styleId="Heading4">
+    <w:name w:val="heading 4"/>
+    <w:basedOn w:val="Normal"/>
+    <w:pPr>
+      <w:keepNext/>
+      <w:spacing w:before="240" w:after="0" w:line="480" w:lineRule="auto"/>
+      <w:ind w:firstLine="0"/>
+      <w:jc w:val="left"/>
+    </w:pPr>
+    <w:rPr>
+      <w:rFonts w:ascii="Times New Roman" w:hAnsi="Times New Roman" w:cs="Times New Roman" w:eastAsia="Times New Roman"/>
+      <w:b/>
+      <w:i w:val="0"/>
+      <w:color w:val="000000"/>
+      <w:sz w:val="24"/>
+    </w:rPr>
+  </w:style>
+  <w:style w:type="paragraph" w:customStyle="1" w:styleId="Heading5">
+    <w:name w:val="heading 5"/>
+    <w:basedOn w:val="Normal"/>
+    <w:pPr>
+      <w:keepNext/>
+      <w:spacing w:before="240" w:after="0" w:line="480" w:lineRule="auto"/>
+      <w:ind w:firstLine="0"/>
+      <w:jc w:val="left"/>
+    </w:pPr>
+    <w:rPr>
+      <w:rFonts w:ascii="Times New Roman" w:hAnsi="Times New Roman" w:cs="Times New Roman" w:eastAsia="Times New Roman"/>
+      <w:b/>
+      <w:i/>
+      <w:color w:val="000000"/>
+      <w:sz w:val="24"/>
     </w:rPr>
   </w:style>
   <w:style w:type="paragraph" w:customStyle="1" w:styleId="Portada">
     <w:name w:val="Portada"/>
     <w:basedOn w:val="Normal"/>
     <w:pPr>
-      <w:spacing w:after="200" w:before="0"/>
+      <w:spacing w:before="0" w:after="0" w:line="480" w:lineRule="auto"/>
       <w:jc w:val="center"/>
     </w:pPr>
     <w:rPr>
-      <w:rFonts w:ascii="Arial" w:hAnsi="Arial" w:cs="Arial" w:eastAsia="Arial"/>
-      <w:b/>
-      <w:color w:val="1F3A68"/>
-      <w:sz w:val="26"/>
-    </w:rPr>
-  </w:style>
-  <w:style w:type="paragraph" w:customStyle="1" w:styleId="PortadaTitulo">
-    <w:name w:val="PortadaTitulo"/>
-    <w:basedOn w:val="Normal"/>
-    <w:pPr>
-      <w:spacing w:after="320" w:before="0"/>
-      <w:jc w:val="center"/>
-    </w:pPr>
-    <w:rPr>
-      <w:rFonts w:ascii="Arial" w:hAnsi="Arial" w:cs="Arial" w:eastAsia="Arial"/>
-      <w:b/>
-      <w:color w:val="1F3A68"/>
-      <w:sz w:val="44"/>
-    </w:rPr>
-  </w:style>
-  <w:style w:type="paragraph" w:customStyle="1" w:styleId="PortadaSub">
-    <w:name w:val="PortadaSub"/>
-    <w:basedOn w:val="Normal"/>
-    <w:pPr>
-      <w:spacing w:after="160" w:before="0"/>
-      <w:jc w:val="center"/>
-    </w:pPr>
-    <w:rPr>
-      <w:rFonts w:ascii="Arial" w:hAnsi="Arial" w:cs="Arial" w:eastAsia="Arial"/>
-      <w:b w:val="0"/>
-      <w:color w:val="52514E"/>
-      <w:sz w:val="22"/>
+      <w:rFonts w:ascii="Times New Roman" w:hAnsi="Times New Roman" w:cs="Times New Roman" w:eastAsia="Times New Roman"/>
+      <w:color w:val="000000"/>
+      <w:sz w:val="24"/>
+    </w:rPr>
+  </w:style>
+  <w:style w:type="paragraph" w:customStyle="1" w:styleId="Referencia">
+    <w:name w:val="Referencia"/>
+    <w:basedOn w:val="Normal"/>
+    <w:pPr>
+      <w:spacing w:before="0" w:after="0" w:line="480" w:lineRule="auto"/>
+      <w:ind w:left="720" w:hanging="720"/>
+      <w:jc w:val="left"/>
+    </w:pPr>
+    <w:rPr>
+      <w:rFonts w:ascii="Times New Roman" w:hAnsi="Times New Roman" w:cs="Times New Roman" w:eastAsia="Times New Roman"/>
+      <w:color w:val="000000"/>
+      <w:sz w:val="24"/>
+    </w:rPr>
+  </w:style>
+  <w:style w:type="paragraph" w:customStyle="1" w:styleId="Nota">
+    <w:name w:val="Nota"/>
+    <w:basedOn w:val="Normal"/>
+    <w:pPr>
+      <w:spacing w:before="0" w:after="240" w:line="480" w:lineRule="auto"/>
+      <w:ind w:firstLine="0"/>
+      <w:jc w:val="left"/>
+    </w:pPr>
+    <w:rPr>
+      <w:rFonts w:ascii="Times New Roman" w:hAnsi="Times New Roman" w:cs="Times New Roman" w:eastAsia="Times New Roman"/>
+      <w:color w:val="000000"/>
+      <w:sz w:val="24"/>
     </w:rPr>
   </w:style>
 </w:styles>

</xml_diff>

<commit_message>
revert: volver a la primera versión (deshace el formato APA 7)
Restaura el estilo original: títulos y tablas con color institucional, Arial 11,
captions 'Tabla N.' y notas 'Fuente:'. Mismo contenido que cc54e62.

Co-Authored-By: Claude Opus 5.5 <noreply@anthropic.com>
Claude-Session: https://claude.ai/code/session_01DvLKNimVRrvQKw6BC5SVu6
</commit_message>
<xml_diff>
--- a/assets/plantillas/plantilla_unicartagena.docx
+++ b/assets/plantillas/plantilla_unicartagena.docx
@@ -384,9 +384,8 @@
     </w:p>
     <w:sectPr>
       <w:footerReference w:type="default" r:id="rId9"/>
-      <w:headerReference w:type="default" r:id="rId10"/>
       <w:pgSz w:w="12240" w:h="15840"/>
-      <w:pgMar w:top="1440" w:bottom="1440" w:left="1440" w:right="1440" w:header="720" w:footer="720"/>
+      <w:pgMar w:top="1417" w:bottom="1417" w:left="1417" w:right="1417" w:footer="680" w:header="680"/>
     </w:sectPr>
   </w:body>
 </w:document>
@@ -401,8 +400,21 @@
   <w:p>
     <w:pPr>
       <w:pStyle w:val="Footer"/>
+      <w:jc w:val="right"/>
     </w:pPr>
     <w:r/>
+    <w:r>
+      <w:rPr>
+        <w:color w:val="52514E"/>
+        <w:sz w:val="16"/>
+      </w:rPr>
+      <w:t xml:space="preserve">Kazegami Restaurante · Seminario Taller Creación de Empresas · Universidad de Cartagena    </w:t>
+    </w:r>
+    <w:r>
+      <w:fldChar w:fldCharType="begin"/>
+      <w:instrText xml:space="preserve">PAGE</w:instrText>
+      <w:fldChar w:fldCharType="end"/>
+    </w:r>
   </w:p>
 </w:ftr>
 </file>
@@ -443,27 +455,6 @@
     </w:p>
   </w:footnote>
 </w:footnotes>
-</file>
-
-<file path=word/header1.xml><?xml version="1.0" encoding="utf-8"?>
-<w:hdr xmlns:m="http://schemas.openxmlformats.org/officeDocument/2006/math" xmlns:mc="http://schemas.openxmlformats.org/markup-compatibility/2006" xmlns:mo="http://schemas.microsoft.com/office/mac/office/2008/main" xmlns:mv="urn:schemas-microsoft-com:mac:vml" xmlns:o="urn:schemas-microsoft-com:office:office" xmlns:r="http://schemas.openxmlformats.org/officeDocument/2006/relationships" xmlns:v="urn:schemas-microsoft-com:vml" xmlns:w10="urn:schemas-microsoft-com:office:word" xmlns:w14="http://schemas.microsoft.com/office/word/2010/wordml" xmlns:w="http://schemas.openxmlformats.org/wordprocessingml/2006/main" xmlns:wne="http://schemas.microsoft.com/office/word/2006/wordml" xmlns:wp14="http://schemas.microsoft.com/office/word/2010/wordprocessingDrawing" xmlns:wp="http://schemas.openxmlformats.org/drawingml/2006/wordprocessingDrawing" xmlns:wpc="http://schemas.microsoft.com/office/word/2010/wordprocessingCanvas" xmlns:wpg="http://schemas.microsoft.com/office/word/2010/wordprocessingGroup" xmlns:wpi="http://schemas.microsoft.com/office/word/2010/wordprocessingInk" xmlns:wps="http://schemas.microsoft.com/office/word/2010/wordprocessingShape" mc:Ignorable="w14 wp14">
-  <w:p>
-    <w:pPr>
-      <w:pStyle w:val="Header"/>
-      <w:jc w:val="right"/>
-    </w:pPr>
-    <w:r/>
-    <w:r>
-      <w:rPr>
-        <w:rFonts w:ascii="Times New Roman" w:hAnsi="Times New Roman"/>
-        <w:sz w:val="24"/>
-      </w:rPr>
-      <w:fldChar w:fldCharType="begin"/>
-      <w:instrText xml:space="preserve">PAGE</w:instrText>
-      <w:fldChar w:fldCharType="end"/>
-    </w:r>
-  </w:p>
-</w:hdr>
 </file>
 
 <file path=word/numbering.xml><?xml version="1.0" encoding="utf-8"?>
@@ -599,13 +590,13 @@
     <w:name w:val="Normal"/>
     <w:qFormat/>
     <w:pPr>
-      <w:spacing w:before="0" w:after="0" w:line="480" w:lineRule="auto"/>
-      <w:jc w:val="left"/>
-    </w:pPr>
-    <w:rPr>
-      <w:rFonts w:ascii="Times New Roman" w:hAnsi="Times New Roman" w:cs="Times New Roman" w:eastAsia="Times New Roman"/>
-      <w:color w:val="000000"/>
-      <w:sz w:val="24"/>
+      <w:spacing w:lineRule="auto" w:line="276" w:after="120" w:before="0"/>
+      <w:jc w:val="both"/>
+    </w:pPr>
+    <w:rPr>
+      <w:rFonts w:ascii="Arial" w:hAnsi="Arial" w:cs="Arial" w:eastAsia="Arial"/>
+      <w:color w:val="1F1F1F"/>
+      <w:sz w:val="22"/>
     </w:rPr>
   </w:style>
   <w:style w:type="paragraph" w:styleId="BodyText">
@@ -613,15 +604,14 @@
     <w:basedOn w:val="Normal"/>
     <w:link w:val="BodyTextChar"/>
     <w:pPr>
-      <w:spacing w:before="0" w:after="0" w:line="480" w:lineRule="auto"/>
-      <w:ind w:firstLine="720"/>
-      <w:jc w:val="left"/>
-    </w:pPr>
-    <w:qFormat/>
-    <w:rPr>
-      <w:rFonts w:ascii="Times New Roman" w:hAnsi="Times New Roman" w:cs="Times New Roman" w:eastAsia="Times New Roman"/>
-      <w:color w:val="000000"/>
-      <w:sz w:val="24"/>
+      <w:spacing w:before="0" w:after="120" w:lineRule="auto" w:line="276"/>
+      <w:jc w:val="both"/>
+    </w:pPr>
+    <w:qFormat/>
+    <w:rPr>
+      <w:rFonts w:ascii="Arial" w:hAnsi="Arial" w:cs="Arial" w:eastAsia="Arial"/>
+      <w:color w:val="1F1F1F"/>
+      <w:sz w:val="22"/>
     </w:rPr>
   </w:style>
   <w:style w:type="paragraph" w:customStyle="1" w:styleId="FirstParagraph">
@@ -630,14 +620,13 @@
     <w:next w:val="BodyText"/>
     <w:qFormat/>
     <w:pPr>
-      <w:spacing w:before="0" w:after="0" w:line="480" w:lineRule="auto"/>
-      <w:ind w:firstLine="720"/>
-      <w:jc w:val="left"/>
-    </w:pPr>
-    <w:rPr>
-      <w:rFonts w:ascii="Times New Roman" w:hAnsi="Times New Roman" w:cs="Times New Roman" w:eastAsia="Times New Roman"/>
-      <w:color w:val="000000"/>
-      <w:sz w:val="24"/>
+      <w:spacing w:lineRule="auto" w:line="276" w:after="120" w:before="0"/>
+      <w:jc w:val="both"/>
+    </w:pPr>
+    <w:rPr>
+      <w:rFonts w:ascii="Arial" w:hAnsi="Arial" w:cs="Arial" w:eastAsia="Arial"/>
+      <w:color w:val="1F1F1F"/>
+      <w:sz w:val="22"/>
     </w:rPr>
   </w:style>
   <w:style w:type="paragraph" w:customStyle="1" w:styleId="Compact">
@@ -645,14 +634,12 @@
     <w:basedOn w:val="BodyText"/>
     <w:qFormat/>
     <w:pPr>
-      <w:spacing w:before="0" w:after="0" w:line="240" w:lineRule="auto"/>
-      <w:ind w:firstLine="0"/>
-      <w:jc w:val="left"/>
-    </w:pPr>
-    <w:rPr>
-      <w:rFonts w:ascii="Times New Roman" w:hAnsi="Times New Roman" w:cs="Times New Roman" w:eastAsia="Times New Roman"/>
-      <w:color w:val="000000"/>
-      <w:sz w:val="24"/>
+      <w:spacing w:before="36" w:after="36" w:lineRule="auto" w:line="276"/>
+    </w:pPr>
+    <w:rPr>
+      <w:rFonts w:ascii="Arial" w:hAnsi="Arial" w:cs="Arial" w:eastAsia="Arial"/>
+      <w:color w:val="1F1F1F"/>
+      <w:sz w:val="22"/>
     </w:rPr>
   </w:style>
   <w:style w:type="paragraph" w:styleId="Title">
@@ -663,16 +650,15 @@
     <w:pPr>
       <w:keepNext/>
       <w:keepLines/>
-      <w:spacing w:before="0" w:after="0" w:line="480" w:lineRule="auto"/>
+      <w:spacing w:before="480" w:after="240"/>
       <w:jc w:val="center"/>
     </w:pPr>
     <w:rPr>
-      <w:rFonts w:ascii="Times New Roman" w:hAnsi="Times New Roman" w:cs="Times New Roman" w:eastAsia="Times New Roman"/>
+      <w:rFonts w:ascii="Arial" w:hAnsi="Arial" w:cs="Arial" w:eastAsia="Arial"/>
       <w:b/>
       <w:bCs/>
-      <w:i w:val="0"/>
-      <w:color w:val="000000"/>
-      <w:sz w:val="24"/>
+      <w:color w:val="1F3A68"/>
+      <w:sz w:val="40"/>
       <w:szCs w:val="36"/>
     </w:rPr>
   </w:style>
@@ -684,15 +670,11 @@
     <w:pPr>
       <w:keepNext/>
       <w:keepLines/>
-      <w:spacing w:before="0" w:after="0" w:line="480" w:lineRule="auto"/>
+      <w:spacing w:before="240" w:after="240"/>
       <w:jc w:val="center"/>
     </w:pPr>
     <w:rPr>
-      <w:rFonts w:ascii="Times New Roman" w:hAnsi="Times New Roman" w:cs="Times New Roman" w:eastAsia="Times New Roman"/>
-      <w:b/>
-      <w:i w:val="0"/>
-      <w:color w:val="000000"/>
-      <w:sz w:val="24"/>
+      <w:sz w:val="30"/>
       <w:szCs w:val="30"/>
     </w:rPr>
   </w:style>
@@ -716,25 +698,6 @@
       <w:jc w:val="center"/>
     </w:pPr>
   </w:style>
-  <w:style w:type="paragraph" w:customStyle="1" w:styleId="AbstractTitle">
-    <w:name w:val="Abstract Title"/>
-    <w:basedOn w:val="Normal"/>
-    <w:next w:val="Abstract"/>
-    <w:qFormat/>
-    <w:pPr>
-      <w:keepNext/>
-      <w:keepLines/>
-      <w:jc w:val="center"/>
-      <w:spacing w:before="300" w:after="0"/>
-    </w:pPr>
-    <w:rPr>
-      <w:sz w:val="20"/>
-      <w:szCs w:val="20"/>
-      <w:b/>
-      <w:color w:val="345A8A"/>
-      &gt;
-    </w:rPr>
-  </w:style>
   <w:style w:type="paragraph" w:customStyle="1" w:styleId="Abstract">
     <w:name w:val="Abstract"/>
     <w:basedOn w:val="Normal"/>
@@ -743,7 +706,7 @@
     <w:pPr>
       <w:keepNext/>
       <w:keepLines/>
-      <w:spacing w:before="100" w:after="300"/>
+      <w:spacing w:before="300" w:after="300"/>
     </w:pPr>
     <w:rPr>
       <w:sz w:val="20"/>
@@ -957,11 +920,6 @@
       <w:spacing w:before="100" w:after="100"/>
       <w:ind w:firstLine="0" w:left="480" w:right="480"/>
     </w:pPr>
-    <w:rPr>
-      <w:rFonts w:ascii="Times New Roman" w:hAnsi="Times New Roman" w:cs="Times New Roman" w:eastAsia="Times New Roman"/>
-      <w:color w:val="000000"/>
-      <w:sz w:val="24"/>
-    </w:rPr>
   </w:style>
   <w:style w:type="paragraph" w:styleId="FootnoteText">
     <w:name w:val="Footnote Text"/>
@@ -970,11 +928,6 @@
     <w:uiPriority w:val="9"/>
     <w:unhideWhenUsed/>
     <w:qFormat/>
-    <w:rPr>
-      <w:rFonts w:ascii="Times New Roman" w:hAnsi="Times New Roman" w:cs="Times New Roman" w:eastAsia="Times New Roman"/>
-      <w:color w:val="000000"/>
-      <w:sz w:val="24"/>
-    </w:rPr>
   </w:style>
   <w:style w:type="character" w:default="1" w:styleId="DefaultParagraphFont">
     <w:name w:val="Default Paragraph Font"/>
@@ -996,21 +949,6 @@
         <w:right w:w="108" w:type="dxa"/>
       </w:tblCellMar>
     </w:tblPr>
-    <w:tblStylePr w:type="firstRow">
-      <w:tblPr>
-        <w:jc w:val="left"/>
-        <w:tblInd w:w="0" w:type="dxa"/>
-      </w:tblPr>
-      <w:trPr>
-        <w:jc w:val="left"/>
-      </w:trPr>
-      <w:tcPr>
-        <w:vAlign w:val="bottom"/>
-        <w:tcBorders>
-          <w:bottom w:val="single"/>
-        </w:tcBorders>
-      </w:tcPr>
-    </w:tblStylePr>
   </w:style>
   <w:style w:type="paragraph" w:customStyle="1" w:styleId="DefinitionTerm">
     <w:name w:val="Definition Term"/>
@@ -1022,20 +960,12 @@
       <w:spacing w:after="0"/>
     </w:pPr>
     <w:rPr>
-      <w:rFonts w:ascii="Times New Roman" w:hAnsi="Times New Roman" w:cs="Times New Roman" w:eastAsia="Times New Roman"/>
       <w:b/>
-      <w:color w:val="000000"/>
-      <w:sz w:val="24"/>
     </w:rPr>
   </w:style>
   <w:style w:type="paragraph" w:customStyle="1" w:styleId="Definition">
     <w:name w:val="Definition"/>
     <w:basedOn w:val="Normal"/>
-    <w:rPr>
-      <w:rFonts w:ascii="Times New Roman" w:hAnsi="Times New Roman" w:cs="Times New Roman" w:eastAsia="Times New Roman"/>
-      <w:color w:val="000000"/>
-      <w:sz w:val="24"/>
-    </w:rPr>
   </w:style>
   <w:style w:type="paragraph" w:styleId="Caption">
     <w:name w:val="Caption"/>
@@ -1053,33 +983,30 @@
     <w:basedOn w:val="Caption"/>
     <w:pPr>
       <w:keepNext/>
-      <w:spacing w:before="0" w:after="0" w:line="480" w:lineRule="auto"/>
-      <w:ind w:firstLine="0"/>
+      <w:spacing w:before="200" w:after="80"/>
       <w:jc w:val="left"/>
     </w:pPr>
     <w:rPr>
-      <w:rFonts w:ascii="Times New Roman" w:hAnsi="Times New Roman" w:cs="Times New Roman" w:eastAsia="Times New Roman"/>
-      <w:b w:val="0"/>
-      <w:i/>
-      <w:color w:val="000000"/>
-      <w:sz w:val="24"/>
+      <w:rFonts w:ascii="Arial" w:hAnsi="Arial" w:cs="Arial" w:eastAsia="Arial"/>
+      <w:b/>
+      <w:i w:val="0"/>
+      <w:color w:val="1F3A68"/>
+      <w:sz w:val="19"/>
     </w:rPr>
   </w:style>
   <w:style w:type="paragraph" w:customStyle="1" w:styleId="ImageCaption">
     <w:name w:val="Image Caption"/>
     <w:basedOn w:val="Caption"/>
     <w:pPr>
-      <w:keepNext/>
-      <w:spacing w:before="0" w:after="0" w:line="480" w:lineRule="auto"/>
-      <w:ind w:firstLine="0"/>
-      <w:jc w:val="left"/>
-    </w:pPr>
-    <w:rPr>
-      <w:rFonts w:ascii="Times New Roman" w:hAnsi="Times New Roman" w:cs="Times New Roman" w:eastAsia="Times New Roman"/>
-      <w:b w:val="0"/>
-      <w:i/>
-      <w:color w:val="000000"/>
-      <w:sz w:val="24"/>
+      <w:spacing w:after="40"/>
+      <w:jc w:val="center"/>
+    </w:pPr>
+    <w:rPr>
+      <w:rFonts w:ascii="Arial" w:hAnsi="Arial" w:cs="Arial" w:eastAsia="Arial"/>
+      <w:b/>
+      <w:i w:val="0"/>
+      <w:color w:val="1F3A68"/>
+      <w:sz w:val="19"/>
     </w:rPr>
   </w:style>
   <w:style w:type="paragraph" w:customStyle="1" w:styleId="Figure">
@@ -1091,7 +1018,6 @@
     <w:basedOn w:val="Figure"/>
     <w:pPr>
       <w:keepNext/>
-      <w:spacing w:before="0" w:after="0" w:line="240" w:lineRule="auto"/>
       <w:jc w:val="center"/>
     </w:pPr>
   </w:style>
@@ -1108,10 +1034,6 @@
       <w:sz w:val="22"/>
     </w:rPr>
   </w:style>
-  <w:style w:type="character" w:customStyle="1" w:styleId="SectionNumber">
-    <w:name w:val="Section Number"/>
-    <w:basedOn w:val="BodyTextChar"/>
-  </w:style>
   <w:style w:type="character" w:styleId="FootnoteReference">
     <w:name w:val="Footnote Reference"/>
     <w:basedOn w:val="BodyTextChar"/>
@@ -1123,8 +1045,7 @@
     <w:name w:val="Hyperlink"/>
     <w:basedOn w:val="BodyTextChar"/>
     <w:rPr>
-      <w:color w:val="000000"/>
-      <w:u w:val="none"/>
+      <w:color w:val="2A78D6"/>
     </w:rPr>
   </w:style>
   <w:style w:type="paragraph" w:styleId="TOCHeading">
@@ -1135,143 +1056,99 @@
     <w:unhideWhenUsed/>
     <w:qFormat/>
     <w:pPr>
-      <w:spacing w:before="0" w:line="480" w:lineRule="auto" w:after="0"/>
-      <w:jc w:val="center"/>
+      <w:spacing w:before="240" w:line="259" w:lineRule="auto"/>
       <w:outlineLvl w:val="9"/>
     </w:pPr>
     <w:rPr>
-      <w:rFonts w:ascii="Times New Roman" w:hAnsi="Times New Roman" w:cs="Times New Roman" w:eastAsia="Times New Roman"/>
+      <w:rFonts w:ascii="Arial" w:hAnsi="Arial" w:cs="Arial" w:eastAsia="Arial"/>
       <w:b/>
       <w:bCs w:val="0"/>
-      <w:i w:val="0"/>
-      <w:color w:val="000000"/>
-      <w:sz w:val="24"/>
+      <w:color w:val="1F3A68"/>
+      <w:sz w:val="32"/>
     </w:rPr>
   </w:style>
   <w:style w:type="paragraph" w:customStyle="1" w:styleId="Heading1">
     <w:name w:val="heading 1"/>
-    <w:basedOn w:val="Normal"/>
-    <w:pPr>
-      <w:keepNext/>
-      <w:spacing w:before="240" w:after="0" w:line="480" w:lineRule="auto"/>
-      <w:ind w:firstLine="0"/>
-      <w:jc w:val="center"/>
-    </w:pPr>
-    <w:rPr>
-      <w:rFonts w:ascii="Times New Roman" w:hAnsi="Times New Roman" w:cs="Times New Roman" w:eastAsia="Times New Roman"/>
+    <w:pPr>
+      <w:keepNext/>
+      <w:spacing w:before="360" w:after="120"/>
+      <w:pBdr>
+        <w:bottom w:val="single" w:sz="8" w:space="4" w:color="2A78D6"/>
+      </w:pBdr>
+    </w:pPr>
+    <w:rPr>
+      <w:rFonts w:ascii="Arial" w:hAnsi="Arial" w:cs="Arial" w:eastAsia="Arial"/>
       <w:b/>
-      <w:i w:val="0"/>
-      <w:color w:val="000000"/>
-      <w:sz w:val="24"/>
+      <w:color w:val="1F3A68"/>
+      <w:sz w:val="32"/>
     </w:rPr>
   </w:style>
   <w:style w:type="paragraph" w:customStyle="1" w:styleId="Heading2">
     <w:name w:val="heading 2"/>
-    <w:basedOn w:val="Normal"/>
-    <w:pPr>
-      <w:keepNext/>
-      <w:spacing w:before="240" w:after="0" w:line="480" w:lineRule="auto"/>
-      <w:ind w:firstLine="0"/>
-      <w:jc w:val="left"/>
-    </w:pPr>
-    <w:rPr>
-      <w:rFonts w:ascii="Times New Roman" w:hAnsi="Times New Roman" w:cs="Times New Roman" w:eastAsia="Times New Roman"/>
+    <w:pPr>
+      <w:keepNext/>
+      <w:spacing w:before="280" w:after="120"/>
+    </w:pPr>
+    <w:rPr>
+      <w:rFonts w:ascii="Arial" w:hAnsi="Arial" w:cs="Arial" w:eastAsia="Arial"/>
       <w:b/>
-      <w:i w:val="0"/>
-      <w:color w:val="000000"/>
-      <w:sz w:val="24"/>
+      <w:color w:val="1F3A68"/>
+      <w:sz w:val="26"/>
     </w:rPr>
   </w:style>
   <w:style w:type="paragraph" w:customStyle="1" w:styleId="Heading3">
     <w:name w:val="heading 3"/>
-    <w:basedOn w:val="Normal"/>
-    <w:pPr>
-      <w:keepNext/>
-      <w:spacing w:before="240" w:after="0" w:line="480" w:lineRule="auto"/>
-      <w:ind w:firstLine="0"/>
-      <w:jc w:val="left"/>
-    </w:pPr>
-    <w:rPr>
-      <w:rFonts w:ascii="Times New Roman" w:hAnsi="Times New Roman" w:cs="Times New Roman" w:eastAsia="Times New Roman"/>
+    <w:pPr>
+      <w:keepNext/>
+      <w:spacing w:before="200" w:after="120"/>
+    </w:pPr>
+    <w:rPr>
+      <w:rFonts w:ascii="Arial" w:hAnsi="Arial" w:cs="Arial" w:eastAsia="Arial"/>
       <w:b/>
-      <w:i/>
-      <w:color w:val="000000"/>
-      <w:sz w:val="24"/>
-    </w:rPr>
-  </w:style>
-  <w:style w:type="paragraph" w:customStyle="1" w:styleId="Heading4">
-    <w:name w:val="heading 4"/>
-    <w:basedOn w:val="Normal"/>
-    <w:pPr>
-      <w:keepNext/>
-      <w:spacing w:before="240" w:after="0" w:line="480" w:lineRule="auto"/>
-      <w:ind w:firstLine="0"/>
-      <w:jc w:val="left"/>
-    </w:pPr>
-    <w:rPr>
-      <w:rFonts w:ascii="Times New Roman" w:hAnsi="Times New Roman" w:cs="Times New Roman" w:eastAsia="Times New Roman"/>
-      <w:b/>
-      <w:i w:val="0"/>
-      <w:color w:val="000000"/>
-      <w:sz w:val="24"/>
-    </w:rPr>
-  </w:style>
-  <w:style w:type="paragraph" w:customStyle="1" w:styleId="Heading5">
-    <w:name w:val="heading 5"/>
-    <w:basedOn w:val="Normal"/>
-    <w:pPr>
-      <w:keepNext/>
-      <w:spacing w:before="240" w:after="0" w:line="480" w:lineRule="auto"/>
-      <w:ind w:firstLine="0"/>
-      <w:jc w:val="left"/>
-    </w:pPr>
-    <w:rPr>
-      <w:rFonts w:ascii="Times New Roman" w:hAnsi="Times New Roman" w:cs="Times New Roman" w:eastAsia="Times New Roman"/>
-      <w:b/>
-      <w:i/>
-      <w:color w:val="000000"/>
-      <w:sz w:val="24"/>
+      <w:color w:val="2A78D6"/>
+      <w:sz w:val="23"/>
     </w:rPr>
   </w:style>
   <w:style w:type="paragraph" w:customStyle="1" w:styleId="Portada">
     <w:name w:val="Portada"/>
     <w:basedOn w:val="Normal"/>
     <w:pPr>
-      <w:spacing w:before="0" w:after="0" w:line="480" w:lineRule="auto"/>
+      <w:spacing w:after="200" w:before="0"/>
       <w:jc w:val="center"/>
     </w:pPr>
     <w:rPr>
-      <w:rFonts w:ascii="Times New Roman" w:hAnsi="Times New Roman" w:cs="Times New Roman" w:eastAsia="Times New Roman"/>
-      <w:color w:val="000000"/>
-      <w:sz w:val="24"/>
-    </w:rPr>
-  </w:style>
-  <w:style w:type="paragraph" w:customStyle="1" w:styleId="Referencia">
-    <w:name w:val="Referencia"/>
-    <w:basedOn w:val="Normal"/>
-    <w:pPr>
-      <w:spacing w:before="0" w:after="0" w:line="480" w:lineRule="auto"/>
-      <w:ind w:left="720" w:hanging="720"/>
-      <w:jc w:val="left"/>
-    </w:pPr>
-    <w:rPr>
-      <w:rFonts w:ascii="Times New Roman" w:hAnsi="Times New Roman" w:cs="Times New Roman" w:eastAsia="Times New Roman"/>
-      <w:color w:val="000000"/>
-      <w:sz w:val="24"/>
-    </w:rPr>
-  </w:style>
-  <w:style w:type="paragraph" w:customStyle="1" w:styleId="Nota">
-    <w:name w:val="Nota"/>
-    <w:basedOn w:val="Normal"/>
-    <w:pPr>
-      <w:spacing w:before="0" w:after="240" w:line="480" w:lineRule="auto"/>
-      <w:ind w:firstLine="0"/>
-      <w:jc w:val="left"/>
-    </w:pPr>
-    <w:rPr>
-      <w:rFonts w:ascii="Times New Roman" w:hAnsi="Times New Roman" w:cs="Times New Roman" w:eastAsia="Times New Roman"/>
-      <w:color w:val="000000"/>
-      <w:sz w:val="24"/>
+      <w:rFonts w:ascii="Arial" w:hAnsi="Arial" w:cs="Arial" w:eastAsia="Arial"/>
+      <w:b/>
+      <w:color w:val="1F3A68"/>
+      <w:sz w:val="26"/>
+    </w:rPr>
+  </w:style>
+  <w:style w:type="paragraph" w:customStyle="1" w:styleId="PortadaTitulo">
+    <w:name w:val="PortadaTitulo"/>
+    <w:basedOn w:val="Normal"/>
+    <w:pPr>
+      <w:spacing w:after="320" w:before="0"/>
+      <w:jc w:val="center"/>
+    </w:pPr>
+    <w:rPr>
+      <w:rFonts w:ascii="Arial" w:hAnsi="Arial" w:cs="Arial" w:eastAsia="Arial"/>
+      <w:b/>
+      <w:color w:val="1F3A68"/>
+      <w:sz w:val="44"/>
+    </w:rPr>
+  </w:style>
+  <w:style w:type="paragraph" w:customStyle="1" w:styleId="PortadaSub">
+    <w:name w:val="PortadaSub"/>
+    <w:basedOn w:val="Normal"/>
+    <w:pPr>
+      <w:spacing w:after="160" w:before="0"/>
+      <w:jc w:val="center"/>
+    </w:pPr>
+    <w:rPr>
+      <w:rFonts w:ascii="Arial" w:hAnsi="Arial" w:cs="Arial" w:eastAsia="Arial"/>
+      <w:b w:val="0"/>
+      <w:color w:val="52514E"/>
+      <w:sz w:val="22"/>
     </w:rPr>
   </w:style>
 </w:styles>

</xml_diff>